<commit_message>
Add Chapter 13: Vegan vs. Vegetarian (Meat-Free) Intelligence Module to Walkthrough Book
</commit_message>
<xml_diff>
--- a/docs/DishDetect_SA_Walkthrough_Book.docx
+++ b/docs/DishDetect_SA_Walkthrough_Book.docx
@@ -60,7 +60,7 @@
         <w:t>github.com/Mehdidar/DishDetect-SA</w:t>
         <w:br/>
         <w:br/>
-        <w:t>Generated: 10 October 2026</w:t>
+        <w:t>Generated: 13 October 2026</w:t>
       </w:r>
     </w:p>
     <w:p>
@@ -258,6 +258,21 @@
       </w:r>
       <w:r>
         <w:t>Next Steps &amp; Roadmap</w:t>
+      </w:r>
+    </w:p>
+    <w:p>
+      <w:pPr>
+        <w:pStyle w:val="ListNumber"/>
+      </w:pPr>
+      <w:r>
+        <w:rPr>
+          <w:b/>
+          <w:color w:val="1F3864"/>
+        </w:rPr>
+        <w:t xml:space="preserve">Chapter 13:  </w:t>
+      </w:r>
+      <w:r>
+        <w:t>Vegan vs. Vegetarian (Meat-Free) Intelligence Module</w:t>
       </w:r>
     </w:p>
     <w:p>
@@ -7922,6 +7937,1733 @@
         <w:t xml:space="preserve">  for community access and benchmarking</w:t>
       </w:r>
     </w:p>
+    <w:p>
+      <w:r>
+        <w:br w:type="page"/>
+      </w:r>
+    </w:p>
+    <w:p>
+      <w:pPr>
+        <w:pStyle w:val="Heading1"/>
+        <w:jc w:val="left"/>
+      </w:pPr>
+      <w:r>
+        <w:rPr>
+          <w:color w:val="1F3864"/>
+        </w:rPr>
+        <w:t>Chapter 13 — Vegan vs. Vegetarian (Meat-Free) Intelligence Module</w:t>
+      </w:r>
+    </w:p>
+    <w:p>
+      <w:r>
+        <w:rPr>
+          <w:b w:val="0"/>
+          <w:i w:val="0"/>
+          <w:sz w:val="22"/>
+        </w:rPr>
+        <w:t>In commercial food apps, dietary screening tools, and restaurant POS systems, consumers frequently require a distinction beyond simply identifying meat. Vegetarians and strict vegans have distinct dietary boundaries: while vegetarians abstain from animal flesh, they may consume dairy (milk, cheese, yogurt), eggs, and clarified butter (samneh / ghee). In contrast, strict vegans consume 100% plant-based foods only. This chapter introduces DishDetect SA's specialized meat-free intelligence module, designed specifically to solve the subtle visual discrimination problem between Vegan and Lacto-Ovo Vegetarian dishes.</w:t>
+      </w:r>
+    </w:p>
+    <w:p/>
+    <w:p>
+      <w:pPr>
+        <w:pStyle w:val="Heading2"/>
+        <w:jc w:val="left"/>
+      </w:pPr>
+      <w:r>
+        <w:rPr>
+          <w:color w:val="2E75B6"/>
+        </w:rPr>
+        <w:t>13.1  Dietary Scope: Strict Meat Exclusion</w:t>
+      </w:r>
+    </w:p>
+    <w:p>
+      <w:r>
+        <w:rPr>
+          <w:b w:val="0"/>
+          <w:i w:val="0"/>
+          <w:sz w:val="22"/>
+        </w:rPr>
+        <w:t>All 10 meat, poultry, fish, and seafood categories (Mixed Grill, Shawarma, Shish Tawook, Grilled Kofta, Meat Maqluba, Meat Pie, Kofta Stew, Shrimp Sayadiyah, Stuffed Pigeon, and Meat Madfoon) were completely excluded. The model evaluates exclusively within the meat-free cohort of 15 Arabic dishes, eliminating trivial meat-vs-salad cues and forcing the neural network to learn fine-grained visual indicators of dairy, eggs, and animal fats.</w:t>
+      </w:r>
+    </w:p>
+    <w:p/>
+    <w:p>
+      <w:pPr>
+        <w:pStyle w:val="Heading2"/>
+        <w:jc w:val="left"/>
+      </w:pPr>
+      <w:r>
+        <w:rPr>
+          <w:color w:val="2E75B6"/>
+        </w:rPr>
+        <w:t>13.2  Culinary &amp; Ingredient Audit of the 15 Meatless Dishes</w:t>
+      </w:r>
+    </w:p>
+    <w:tbl>
+      <w:tblPr>
+        <w:tblStyle w:val="TableGrid"/>
+        <w:tblW w:type="auto" w:w="0"/>
+        <w:jc w:val="center"/>
+        <w:tblLook w:firstColumn="1" w:firstRow="1" w:lastColumn="0" w:lastRow="0" w:noHBand="0" w:noVBand="1" w:val="04A0"/>
+      </w:tblPr>
+      <w:tblGrid>
+        <w:gridCol w:w="2436"/>
+        <w:gridCol w:w="2436"/>
+        <w:gridCol w:w="2436"/>
+        <w:gridCol w:w="2436"/>
+      </w:tblGrid>
+      <w:tr>
+        <w:tc>
+          <w:tcPr>
+            <w:tcW w:type="dxa" w:w="2436"/>
+            <w:shd w:val="clear" w:color="auto" w:fill="1F3864"/>
+          </w:tcPr>
+          <w:p>
+            <w:r>
+              <w:rPr>
+                <w:b/>
+                <w:color w:val="FFFFFF"/>
+              </w:rPr>
+              <w:t>Dish Name</w:t>
+            </w:r>
+          </w:p>
+        </w:tc>
+        <w:tc>
+          <w:tcPr>
+            <w:tcW w:type="dxa" w:w="2436"/>
+            <w:shd w:val="clear" w:color="auto" w:fill="1F3864"/>
+          </w:tcPr>
+          <w:p>
+            <w:r>
+              <w:rPr>
+                <w:b/>
+                <w:color w:val="FFFFFF"/>
+              </w:rPr>
+              <w:t>Dietary Category</w:t>
+            </w:r>
+          </w:p>
+        </w:tc>
+        <w:tc>
+          <w:tcPr>
+            <w:tcW w:type="dxa" w:w="2436"/>
+            <w:shd w:val="clear" w:color="auto" w:fill="1F3864"/>
+          </w:tcPr>
+          <w:p>
+            <w:r>
+              <w:rPr>
+                <w:b/>
+                <w:color w:val="FFFFFF"/>
+              </w:rPr>
+              <w:t>Images</w:t>
+            </w:r>
+          </w:p>
+        </w:tc>
+        <w:tc>
+          <w:tcPr>
+            <w:tcW w:type="dxa" w:w="2436"/>
+            <w:shd w:val="clear" w:color="auto" w:fill="1F3864"/>
+          </w:tcPr>
+          <w:p>
+            <w:r>
+              <w:rPr>
+                <w:b/>
+                <w:color w:val="FFFFFF"/>
+              </w:rPr>
+              <w:t>Key Ingredients &amp; Animal Byproduct Audit</w:t>
+            </w:r>
+          </w:p>
+        </w:tc>
+      </w:tr>
+      <w:tr>
+        <w:tc>
+          <w:tcPr>
+            <w:tcW w:type="dxa" w:w="2436"/>
+            <w:shd w:val="clear" w:color="auto" w:fill="F2F6FC"/>
+          </w:tcPr>
+          <w:p>
+            <w:r>
+              <w:t>Hummus</w:t>
+            </w:r>
+          </w:p>
+        </w:tc>
+        <w:tc>
+          <w:tcPr>
+            <w:tcW w:type="dxa" w:w="2436"/>
+            <w:shd w:val="clear" w:color="auto" w:fill="F2F6FC"/>
+          </w:tcPr>
+          <w:p>
+            <w:r>
+              <w:t>Vegan</w:t>
+            </w:r>
+          </w:p>
+        </w:tc>
+        <w:tc>
+          <w:tcPr>
+            <w:tcW w:type="dxa" w:w="2436"/>
+            <w:shd w:val="clear" w:color="auto" w:fill="F2F6FC"/>
+          </w:tcPr>
+          <w:p>
+            <w:r>
+              <w:t>61</w:t>
+            </w:r>
+          </w:p>
+        </w:tc>
+        <w:tc>
+          <w:tcPr>
+            <w:tcW w:type="dxa" w:w="2436"/>
+            <w:shd w:val="clear" w:color="auto" w:fill="F2F6FC"/>
+          </w:tcPr>
+          <w:p>
+            <w:r>
+              <w:t>Chickpeas, tahini (sesame paste), olive oil, garlic. 100% plant-based.</w:t>
+            </w:r>
+          </w:p>
+        </w:tc>
+      </w:tr>
+      <w:tr>
+        <w:tc>
+          <w:tcPr>
+            <w:tcW w:type="dxa" w:w="2436"/>
+            <w:shd w:val="clear" w:color="auto" w:fill="FFFFFF"/>
+          </w:tcPr>
+          <w:p>
+            <w:r>
+              <w:t>Tamees Bread</w:t>
+            </w:r>
+          </w:p>
+        </w:tc>
+        <w:tc>
+          <w:tcPr>
+            <w:tcW w:type="dxa" w:w="2436"/>
+            <w:shd w:val="clear" w:color="auto" w:fill="FFFFFF"/>
+          </w:tcPr>
+          <w:p>
+            <w:r>
+              <w:t>Vegan</w:t>
+            </w:r>
+          </w:p>
+        </w:tc>
+        <w:tc>
+          <w:tcPr>
+            <w:tcW w:type="dxa" w:w="2436"/>
+            <w:shd w:val="clear" w:color="auto" w:fill="FFFFFF"/>
+          </w:tcPr>
+          <w:p>
+            <w:r>
+              <w:t>53</w:t>
+            </w:r>
+          </w:p>
+        </w:tc>
+        <w:tc>
+          <w:tcPr>
+            <w:tcW w:type="dxa" w:w="2436"/>
+            <w:shd w:val="clear" w:color="auto" w:fill="FFFFFF"/>
+          </w:tcPr>
+          <w:p>
+            <w:r>
+              <w:t>Wheat flour, yeast, water, vegetable oil (tandoor-baked). No dairy.</w:t>
+            </w:r>
+          </w:p>
+        </w:tc>
+      </w:tr>
+      <w:tr>
+        <w:tc>
+          <w:tcPr>
+            <w:tcW w:type="dxa" w:w="2436"/>
+            <w:shd w:val="clear" w:color="auto" w:fill="F2F6FC"/>
+          </w:tcPr>
+          <w:p>
+            <w:r>
+              <w:t>Za’atar Manakish</w:t>
+            </w:r>
+          </w:p>
+        </w:tc>
+        <w:tc>
+          <w:tcPr>
+            <w:tcW w:type="dxa" w:w="2436"/>
+            <w:shd w:val="clear" w:color="auto" w:fill="F2F6FC"/>
+          </w:tcPr>
+          <w:p>
+            <w:r>
+              <w:t>Vegan</w:t>
+            </w:r>
+          </w:p>
+        </w:tc>
+        <w:tc>
+          <w:tcPr>
+            <w:tcW w:type="dxa" w:w="2436"/>
+            <w:shd w:val="clear" w:color="auto" w:fill="F2F6FC"/>
+          </w:tcPr>
+          <w:p>
+            <w:r>
+              <w:t>52</w:t>
+            </w:r>
+          </w:p>
+        </w:tc>
+        <w:tc>
+          <w:tcPr>
+            <w:tcW w:type="dxa" w:w="2436"/>
+            <w:shd w:val="clear" w:color="auto" w:fill="F2F6FC"/>
+          </w:tcPr>
+          <w:p>
+            <w:r>
+              <w:t>Flatbread with wild thyme, sumac, sesame, extra virgin olive oil.</w:t>
+            </w:r>
+          </w:p>
+        </w:tc>
+      </w:tr>
+      <w:tr>
+        <w:tc>
+          <w:tcPr>
+            <w:tcW w:type="dxa" w:w="2436"/>
+            <w:shd w:val="clear" w:color="auto" w:fill="FFFFFF"/>
+          </w:tcPr>
+          <w:p>
+            <w:r>
+              <w:t>Okra Tagine</w:t>
+            </w:r>
+          </w:p>
+        </w:tc>
+        <w:tc>
+          <w:tcPr>
+            <w:tcW w:type="dxa" w:w="2436"/>
+            <w:shd w:val="clear" w:color="auto" w:fill="FFFFFF"/>
+          </w:tcPr>
+          <w:p>
+            <w:r>
+              <w:t>Vegan</w:t>
+            </w:r>
+          </w:p>
+        </w:tc>
+        <w:tc>
+          <w:tcPr>
+            <w:tcW w:type="dxa" w:w="2436"/>
+            <w:shd w:val="clear" w:color="auto" w:fill="FFFFFF"/>
+          </w:tcPr>
+          <w:p>
+            <w:r>
+              <w:t>45</w:t>
+            </w:r>
+          </w:p>
+        </w:tc>
+        <w:tc>
+          <w:tcPr>
+            <w:tcW w:type="dxa" w:w="2436"/>
+            <w:shd w:val="clear" w:color="auto" w:fill="FFFFFF"/>
+          </w:tcPr>
+          <w:p>
+            <w:r>
+              <w:t>Bamya bil-Zayt: Baby okra pods, tomato gravy, coriander, olive oil.</w:t>
+            </w:r>
+          </w:p>
+        </w:tc>
+      </w:tr>
+      <w:tr>
+        <w:tc>
+          <w:tcPr>
+            <w:tcW w:type="dxa" w:w="2436"/>
+            <w:shd w:val="clear" w:color="auto" w:fill="F2F6FC"/>
+          </w:tcPr>
+          <w:p>
+            <w:r>
+              <w:t>Sesame Brittle</w:t>
+            </w:r>
+          </w:p>
+        </w:tc>
+        <w:tc>
+          <w:tcPr>
+            <w:tcW w:type="dxa" w:w="2436"/>
+            <w:shd w:val="clear" w:color="auto" w:fill="F2F6FC"/>
+          </w:tcPr>
+          <w:p>
+            <w:r>
+              <w:t>Vegan</w:t>
+            </w:r>
+          </w:p>
+        </w:tc>
+        <w:tc>
+          <w:tcPr>
+            <w:tcW w:type="dxa" w:w="2436"/>
+            <w:shd w:val="clear" w:color="auto" w:fill="F2F6FC"/>
+          </w:tcPr>
+          <w:p>
+            <w:r>
+              <w:t>45</w:t>
+            </w:r>
+          </w:p>
+        </w:tc>
+        <w:tc>
+          <w:tcPr>
+            <w:tcW w:type="dxa" w:w="2436"/>
+            <w:shd w:val="clear" w:color="auto" w:fill="F2F6FC"/>
+          </w:tcPr>
+          <w:p>
+            <w:r>
+              <w:t>Simsimiya: Roasted sesame seeds bound with sugar syrup &amp; lemon.</w:t>
+            </w:r>
+          </w:p>
+        </w:tc>
+      </w:tr>
+      <w:tr>
+        <w:tc>
+          <w:tcPr>
+            <w:tcW w:type="dxa" w:w="2436"/>
+            <w:shd w:val="clear" w:color="auto" w:fill="FFFFFF"/>
+          </w:tcPr>
+          <w:p>
+            <w:r>
+              <w:t>Spinach Fatayer</w:t>
+            </w:r>
+          </w:p>
+        </w:tc>
+        <w:tc>
+          <w:tcPr>
+            <w:tcW w:type="dxa" w:w="2436"/>
+            <w:shd w:val="clear" w:color="auto" w:fill="FFFFFF"/>
+          </w:tcPr>
+          <w:p>
+            <w:r>
+              <w:t>Vegan</w:t>
+            </w:r>
+          </w:p>
+        </w:tc>
+        <w:tc>
+          <w:tcPr>
+            <w:tcW w:type="dxa" w:w="2436"/>
+            <w:shd w:val="clear" w:color="auto" w:fill="FFFFFF"/>
+          </w:tcPr>
+          <w:p>
+            <w:r>
+              <w:t>44</w:t>
+            </w:r>
+          </w:p>
+        </w:tc>
+        <w:tc>
+          <w:tcPr>
+            <w:tcW w:type="dxa" w:w="2436"/>
+            <w:shd w:val="clear" w:color="auto" w:fill="FFFFFF"/>
+          </w:tcPr>
+          <w:p>
+            <w:r>
+              <w:t>Levantine spinach pie: Spinach, onions, sumac, olive oil dough.</w:t>
+            </w:r>
+          </w:p>
+        </w:tc>
+      </w:tr>
+      <w:tr>
+        <w:tc>
+          <w:tcPr>
+            <w:tcW w:type="dxa" w:w="2436"/>
+            <w:shd w:val="clear" w:color="auto" w:fill="F2F6FC"/>
+          </w:tcPr>
+          <w:p>
+            <w:r>
+              <w:t>Onion Soup</w:t>
+            </w:r>
+          </w:p>
+        </w:tc>
+        <w:tc>
+          <w:tcPr>
+            <w:tcW w:type="dxa" w:w="2436"/>
+            <w:shd w:val="clear" w:color="auto" w:fill="F2F6FC"/>
+          </w:tcPr>
+          <w:p>
+            <w:r>
+              <w:t>Vegan</w:t>
+            </w:r>
+          </w:p>
+        </w:tc>
+        <w:tc>
+          <w:tcPr>
+            <w:tcW w:type="dxa" w:w="2436"/>
+            <w:shd w:val="clear" w:color="auto" w:fill="F2F6FC"/>
+          </w:tcPr>
+          <w:p>
+            <w:r>
+              <w:t>42</w:t>
+            </w:r>
+          </w:p>
+        </w:tc>
+        <w:tc>
+          <w:tcPr>
+            <w:tcW w:type="dxa" w:w="2436"/>
+            <w:shd w:val="clear" w:color="auto" w:fill="F2F6FC"/>
+          </w:tcPr>
+          <w:p>
+            <w:r>
+              <w:t>Shorbat Basal: Caramelized onions, olive oil, vegetable broth, cumin.</w:t>
+            </w:r>
+          </w:p>
+        </w:tc>
+      </w:tr>
+      <w:tr>
+        <w:tc>
+          <w:tcPr>
+            <w:tcW w:type="dxa" w:w="2436"/>
+            <w:shd w:val="clear" w:color="auto" w:fill="FFFFFF"/>
+          </w:tcPr>
+          <w:p>
+            <w:r>
+              <w:t>Pomegranate Fattoush</w:t>
+            </w:r>
+          </w:p>
+        </w:tc>
+        <w:tc>
+          <w:tcPr>
+            <w:tcW w:type="dxa" w:w="2436"/>
+            <w:shd w:val="clear" w:color="auto" w:fill="FFFFFF"/>
+          </w:tcPr>
+          <w:p>
+            <w:r>
+              <w:t>Vegan</w:t>
+            </w:r>
+          </w:p>
+        </w:tc>
+        <w:tc>
+          <w:tcPr>
+            <w:tcW w:type="dxa" w:w="2436"/>
+            <w:shd w:val="clear" w:color="auto" w:fill="FFFFFF"/>
+          </w:tcPr>
+          <w:p>
+            <w:r>
+              <w:t>37</w:t>
+            </w:r>
+          </w:p>
+        </w:tc>
+        <w:tc>
+          <w:tcPr>
+            <w:tcW w:type="dxa" w:w="2436"/>
+            <w:shd w:val="clear" w:color="auto" w:fill="FFFFFF"/>
+          </w:tcPr>
+          <w:p>
+            <w:r>
+              <w:t>Romaine, tomatoes, cucumbers, toasted pita chips, pomegranate molasses.</w:t>
+            </w:r>
+          </w:p>
+        </w:tc>
+      </w:tr>
+      <w:tr>
+        <w:tc>
+          <w:tcPr>
+            <w:tcW w:type="dxa" w:w="2436"/>
+            <w:shd w:val="clear" w:color="auto" w:fill="F2F6FC"/>
+          </w:tcPr>
+          <w:p>
+            <w:r>
+              <w:t>Spinach Stew</w:t>
+            </w:r>
+          </w:p>
+        </w:tc>
+        <w:tc>
+          <w:tcPr>
+            <w:tcW w:type="dxa" w:w="2436"/>
+            <w:shd w:val="clear" w:color="auto" w:fill="F2F6FC"/>
+          </w:tcPr>
+          <w:p>
+            <w:r>
+              <w:t>Vegan</w:t>
+            </w:r>
+          </w:p>
+        </w:tc>
+        <w:tc>
+          <w:tcPr>
+            <w:tcW w:type="dxa" w:w="2436"/>
+            <w:shd w:val="clear" w:color="auto" w:fill="F2F6FC"/>
+          </w:tcPr>
+          <w:p>
+            <w:r>
+              <w:t>32</w:t>
+            </w:r>
+          </w:p>
+        </w:tc>
+        <w:tc>
+          <w:tcPr>
+            <w:tcW w:type="dxa" w:w="2436"/>
+            <w:shd w:val="clear" w:color="auto" w:fill="F2F6FC"/>
+          </w:tcPr>
+          <w:p>
+            <w:r>
+              <w:t>Sabanegh bil-Zayt: Fresh spinach, chickpeas, garlic, olive oil.</w:t>
+            </w:r>
+          </w:p>
+        </w:tc>
+      </w:tr>
+      <w:tr>
+        <w:tc>
+          <w:tcPr>
+            <w:tcW w:type="dxa" w:w="2436"/>
+            <w:shd w:val="clear" w:color="auto" w:fill="FFFFFF"/>
+          </w:tcPr>
+          <w:p>
+            <w:r>
+              <w:t>Fatayer Cheese</w:t>
+            </w:r>
+          </w:p>
+        </w:tc>
+        <w:tc>
+          <w:tcPr>
+            <w:tcW w:type="dxa" w:w="2436"/>
+            <w:shd w:val="clear" w:color="auto" w:fill="FFFFFF"/>
+          </w:tcPr>
+          <w:p>
+            <w:r>
+              <w:t>Vegetarian</w:t>
+            </w:r>
+          </w:p>
+        </w:tc>
+        <w:tc>
+          <w:tcPr>
+            <w:tcW w:type="dxa" w:w="2436"/>
+            <w:shd w:val="clear" w:color="auto" w:fill="FFFFFF"/>
+          </w:tcPr>
+          <w:p>
+            <w:r>
+              <w:t>86</w:t>
+            </w:r>
+          </w:p>
+        </w:tc>
+        <w:tc>
+          <w:tcPr>
+            <w:tcW w:type="dxa" w:w="2436"/>
+            <w:shd w:val="clear" w:color="auto" w:fill="FFFFFF"/>
+          </w:tcPr>
+          <w:p>
+            <w:r>
+              <w:t>Pastry filled with dairy cheese (Akkawi / Halloumi / Nabulsi) &amp; butter.</w:t>
+            </w:r>
+          </w:p>
+        </w:tc>
+      </w:tr>
+      <w:tr>
+        <w:tc>
+          <w:tcPr>
+            <w:tcW w:type="dxa" w:w="2436"/>
+            <w:shd w:val="clear" w:color="auto" w:fill="F2F6FC"/>
+          </w:tcPr>
+          <w:p>
+            <w:r>
+              <w:t>Saffron Cake</w:t>
+            </w:r>
+          </w:p>
+        </w:tc>
+        <w:tc>
+          <w:tcPr>
+            <w:tcW w:type="dxa" w:w="2436"/>
+            <w:shd w:val="clear" w:color="auto" w:fill="F2F6FC"/>
+          </w:tcPr>
+          <w:p>
+            <w:r>
+              <w:t>Vegetarian</w:t>
+            </w:r>
+          </w:p>
+        </w:tc>
+        <w:tc>
+          <w:tcPr>
+            <w:tcW w:type="dxa" w:w="2436"/>
+            <w:shd w:val="clear" w:color="auto" w:fill="F2F6FC"/>
+          </w:tcPr>
+          <w:p>
+            <w:r>
+              <w:t>59</w:t>
+            </w:r>
+          </w:p>
+        </w:tc>
+        <w:tc>
+          <w:tcPr>
+            <w:tcW w:type="dxa" w:w="2436"/>
+            <w:shd w:val="clear" w:color="auto" w:fill="F2F6FC"/>
+          </w:tcPr>
+          <w:p>
+            <w:r>
+              <w:t>Sponge cake made with eggs, soaked in saffron condensed milk &amp; cream.</w:t>
+            </w:r>
+          </w:p>
+        </w:tc>
+      </w:tr>
+      <w:tr>
+        <w:tc>
+          <w:tcPr>
+            <w:tcW w:type="dxa" w:w="2436"/>
+            <w:shd w:val="clear" w:color="auto" w:fill="FFFFFF"/>
+          </w:tcPr>
+          <w:p>
+            <w:r>
+              <w:t>Rice Pudding</w:t>
+            </w:r>
+          </w:p>
+        </w:tc>
+        <w:tc>
+          <w:tcPr>
+            <w:tcW w:type="dxa" w:w="2436"/>
+            <w:shd w:val="clear" w:color="auto" w:fill="FFFFFF"/>
+          </w:tcPr>
+          <w:p>
+            <w:r>
+              <w:t>Vegetarian</w:t>
+            </w:r>
+          </w:p>
+        </w:tc>
+        <w:tc>
+          <w:tcPr>
+            <w:tcW w:type="dxa" w:w="2436"/>
+            <w:shd w:val="clear" w:color="auto" w:fill="FFFFFF"/>
+          </w:tcPr>
+          <w:p>
+            <w:r>
+              <w:t>57</w:t>
+            </w:r>
+          </w:p>
+        </w:tc>
+        <w:tc>
+          <w:tcPr>
+            <w:tcW w:type="dxa" w:w="2436"/>
+            <w:shd w:val="clear" w:color="auto" w:fill="FFFFFF"/>
+          </w:tcPr>
+          <w:p>
+            <w:r>
+              <w:t>Roz Bel Laban: Short-grain rice cooked in whole cow's milk &amp; ashta cream.</w:t>
+            </w:r>
+          </w:p>
+        </w:tc>
+      </w:tr>
+      <w:tr>
+        <w:tc>
+          <w:tcPr>
+            <w:tcW w:type="dxa" w:w="2436"/>
+            <w:shd w:val="clear" w:color="auto" w:fill="F2F6FC"/>
+          </w:tcPr>
+          <w:p>
+            <w:r>
+              <w:t>Pistachio Sweet</w:t>
+            </w:r>
+          </w:p>
+        </w:tc>
+        <w:tc>
+          <w:tcPr>
+            <w:tcW w:type="dxa" w:w="2436"/>
+            <w:shd w:val="clear" w:color="auto" w:fill="F2F6FC"/>
+          </w:tcPr>
+          <w:p>
+            <w:r>
+              <w:t>Vegetarian</w:t>
+            </w:r>
+          </w:p>
+        </w:tc>
+        <w:tc>
+          <w:tcPr>
+            <w:tcW w:type="dxa" w:w="2436"/>
+            <w:shd w:val="clear" w:color="auto" w:fill="F2F6FC"/>
+          </w:tcPr>
+          <w:p>
+            <w:r>
+              <w:t>57</w:t>
+            </w:r>
+          </w:p>
+        </w:tc>
+        <w:tc>
+          <w:tcPr>
+            <w:tcW w:type="dxa" w:w="2436"/>
+            <w:shd w:val="clear" w:color="auto" w:fill="F2F6FC"/>
+          </w:tcPr>
+          <w:p>
+            <w:r>
+              <w:t>Halawet el-Jibn / Mafroukeh: Contains sweet cheese, ashta, &amp; samneh.</w:t>
+            </w:r>
+          </w:p>
+        </w:tc>
+      </w:tr>
+      <w:tr>
+        <w:tc>
+          <w:tcPr>
+            <w:tcW w:type="dxa" w:w="2436"/>
+            <w:shd w:val="clear" w:color="auto" w:fill="FFFFFF"/>
+          </w:tcPr>
+          <w:p>
+            <w:r>
+              <w:t>Pistachio Tamriya</w:t>
+            </w:r>
+          </w:p>
+        </w:tc>
+        <w:tc>
+          <w:tcPr>
+            <w:tcW w:type="dxa" w:w="2436"/>
+            <w:shd w:val="clear" w:color="auto" w:fill="FFFFFF"/>
+          </w:tcPr>
+          <w:p>
+            <w:r>
+              <w:t>Vegetarian</w:t>
+            </w:r>
+          </w:p>
+        </w:tc>
+        <w:tc>
+          <w:tcPr>
+            <w:tcW w:type="dxa" w:w="2436"/>
+            <w:shd w:val="clear" w:color="auto" w:fill="FFFFFF"/>
+          </w:tcPr>
+          <w:p>
+            <w:r>
+              <w:t>21</w:t>
+            </w:r>
+          </w:p>
+        </w:tc>
+        <w:tc>
+          <w:tcPr>
+            <w:tcW w:type="dxa" w:w="2436"/>
+            <w:shd w:val="clear" w:color="auto" w:fill="FFFFFF"/>
+          </w:tcPr>
+          <w:p>
+            <w:r>
+              <w:t>Date confection pan-roasted in clarified butter (samneh / ghee).</w:t>
+            </w:r>
+          </w:p>
+        </w:tc>
+      </w:tr>
+      <w:tr>
+        <w:tc>
+          <w:tcPr>
+            <w:tcW w:type="dxa" w:w="2436"/>
+            <w:shd w:val="clear" w:color="auto" w:fill="F2F6FC"/>
+          </w:tcPr>
+          <w:p>
+            <w:r>
+              <w:t>Tamriya</w:t>
+            </w:r>
+          </w:p>
+        </w:tc>
+        <w:tc>
+          <w:tcPr>
+            <w:tcW w:type="dxa" w:w="2436"/>
+            <w:shd w:val="clear" w:color="auto" w:fill="F2F6FC"/>
+          </w:tcPr>
+          <w:p>
+            <w:r>
+              <w:t>Vegetarian</w:t>
+            </w:r>
+          </w:p>
+        </w:tc>
+        <w:tc>
+          <w:tcPr>
+            <w:tcW w:type="dxa" w:w="2436"/>
+            <w:shd w:val="clear" w:color="auto" w:fill="F2F6FC"/>
+          </w:tcPr>
+          <w:p>
+            <w:r>
+              <w:t>13</w:t>
+            </w:r>
+          </w:p>
+        </w:tc>
+        <w:tc>
+          <w:tcPr>
+            <w:tcW w:type="dxa" w:w="2436"/>
+            <w:shd w:val="clear" w:color="auto" w:fill="F2F6FC"/>
+          </w:tcPr>
+          <w:p>
+            <w:r>
+              <w:t>Authentic Saudi date confection roasted in samneh (animal butterfat).</w:t>
+            </w:r>
+          </w:p>
+        </w:tc>
+      </w:tr>
+    </w:tbl>
+    <w:p/>
+    <w:p>
+      <w:r>
+        <w:drawing>
+          <wp:inline xmlns:a="http://schemas.openxmlformats.org/drawingml/2006/main" xmlns:pic="http://schemas.openxmlformats.org/drawingml/2006/picture">
+            <wp:extent cx="5669280" cy="2294223"/>
+            <wp:docPr id="17" name="Picture 17"/>
+            <wp:cNvGraphicFramePr>
+              <a:graphicFrameLocks noChangeAspect="1"/>
+            </wp:cNvGraphicFramePr>
+            <a:graphic>
+              <a:graphicData uri="http://schemas.openxmlformats.org/drawingml/2006/picture">
+                <pic:pic>
+                  <pic:nvPicPr>
+                    <pic:cNvPr id="0" name="09_vegan_intelligence.png"/>
+                    <pic:cNvPicPr/>
+                  </pic:nvPicPr>
+                  <pic:blipFill>
+                    <a:blip r:embed="rId25"/>
+                    <a:stretch>
+                      <a:fillRect/>
+                    </a:stretch>
+                  </pic:blipFill>
+                  <pic:spPr>
+                    <a:xfrm>
+                      <a:off x="0" y="0"/>
+                      <a:ext cx="5669280" cy="2294223"/>
+                    </a:xfrm>
+                    <a:prstGeom prst="rect"/>
+                  </pic:spPr>
+                </pic:pic>
+              </a:graphicData>
+            </a:graphic>
+          </wp:inline>
+        </w:drawing>
+      </w:r>
+    </w:p>
+    <w:p>
+      <w:pPr>
+        <w:jc w:val="center"/>
+      </w:pPr>
+      <w:r>
+        <w:rPr>
+          <w:i/>
+          <w:color w:val="595959"/>
+          <w:sz w:val="18"/>
+        </w:rPr>
+        <w:t>Figure 9 — Vegan vs. Vegetarian dataset composition (left) and benchmark performance across splits (right)</w:t>
+      </w:r>
+    </w:p>
+    <w:p/>
+    <w:p>
+      <w:pPr>
+        <w:pStyle w:val="Heading2"/>
+        <w:jc w:val="left"/>
+      </w:pPr>
+      <w:r>
+        <w:rPr>
+          <w:color w:val="2E75B6"/>
+        </w:rPr>
+        <w:t>13.3  Model Architecture &amp; Training Schedule</w:t>
+      </w:r>
+    </w:p>
+    <w:p>
+      <w:pPr>
+        <w:pStyle w:val="ListBullet"/>
+      </w:pPr>
+      <w:r>
+        <w:rPr>
+          <w:b/>
+          <w:color w:val="1F3864"/>
+        </w:rPr>
+        <w:t>Architecture:</w:t>
+      </w:r>
+      <w:r>
+        <w:t xml:space="preserve">  MobileNetV3-Large (torchvision), ImageNet pretrained</w:t>
+      </w:r>
+    </w:p>
+    <w:p>
+      <w:pPr>
+        <w:pStyle w:val="ListBullet"/>
+      </w:pPr>
+      <w:r>
+        <w:rPr>
+          <w:b/>
+          <w:color w:val="1F3864"/>
+        </w:rPr>
+        <w:t>Input Resolution:</w:t>
+      </w:r>
+      <w:r>
+        <w:t xml:space="preserve">  224×224 pixels</w:t>
+      </w:r>
+    </w:p>
+    <w:p>
+      <w:pPr>
+        <w:pStyle w:val="ListBullet"/>
+      </w:pPr>
+      <w:r>
+        <w:rPr>
+          <w:b/>
+          <w:color w:val="1F3864"/>
+        </w:rPr>
+        <w:t>Transfer Learning Schedule:</w:t>
+      </w:r>
+      <w:r>
+        <w:t xml:space="preserve">  Stage 1 (Classifier Head, LR 1e-3, AdamW) for 10 epochs → Stage 2 (Backbone fine-tuning, LR 1e-5, Cosine Annealing) for 15 epochs</w:t>
+      </w:r>
+    </w:p>
+    <w:p>
+      <w:pPr>
+        <w:pStyle w:val="ListBullet"/>
+      </w:pPr>
+      <w:r>
+        <w:rPr>
+          <w:b/>
+          <w:color w:val="1F3864"/>
+        </w:rPr>
+        <w:t>Loss Function:</w:t>
+      </w:r>
+      <w:r>
+        <w:t xml:space="preserve">  Cross-Entropy with inverse-frequency class weights (Vegan: 0.86, Vegetarian: 1.20) to counter the mild 1.4:1 ratio</w:t>
+      </w:r>
+    </w:p>
+    <w:p>
+      <w:pPr>
+        <w:pStyle w:val="ListBullet"/>
+      </w:pPr>
+      <w:r>
+        <w:rPr>
+          <w:b/>
+          <w:color w:val="1F3864"/>
+        </w:rPr>
+        <w:t>Leakage Prevention:</w:t>
+      </w:r>
+      <w:r>
+        <w:t xml:space="preserve">  Three-way 70/15/15 split grouped by perceptual hash (phash &lt;= 5) to isolate near-duplicates</w:t>
+      </w:r>
+    </w:p>
+    <w:p/>
+    <w:p>
+      <w:pPr>
+        <w:pStyle w:val="Heading2"/>
+        <w:jc w:val="left"/>
+      </w:pPr>
+      <w:r>
+        <w:rPr>
+          <w:color w:val="2E75B6"/>
+        </w:rPr>
+        <w:t>13.4  Experimental Results &amp; Test Set Benchmarks</w:t>
+      </w:r>
+    </w:p>
+    <w:tbl>
+      <w:tblPr>
+        <w:tblStyle w:val="TableGrid"/>
+        <w:tblW w:type="auto" w:w="0"/>
+        <w:jc w:val="center"/>
+        <w:tblLook w:firstColumn="1" w:firstRow="1" w:lastColumn="0" w:lastRow="0" w:noHBand="0" w:noVBand="1" w:val="04A0"/>
+      </w:tblPr>
+      <w:tblGrid>
+        <w:gridCol w:w="1624"/>
+        <w:gridCol w:w="1624"/>
+        <w:gridCol w:w="1624"/>
+        <w:gridCol w:w="1624"/>
+        <w:gridCol w:w="1624"/>
+        <w:gridCol w:w="1624"/>
+      </w:tblGrid>
+      <w:tr>
+        <w:tc>
+          <w:tcPr>
+            <w:tcW w:type="dxa" w:w="1624"/>
+            <w:shd w:val="clear" w:color="auto" w:fill="1F3864"/>
+          </w:tcPr>
+          <w:p>
+            <w:r>
+              <w:rPr>
+                <w:b/>
+                <w:color w:val="FFFFFF"/>
+              </w:rPr>
+              <w:t>Evaluation Split</w:t>
+            </w:r>
+          </w:p>
+        </w:tc>
+        <w:tc>
+          <w:tcPr>
+            <w:tcW w:type="dxa" w:w="1624"/>
+            <w:shd w:val="clear" w:color="auto" w:fill="1F3864"/>
+          </w:tcPr>
+          <w:p>
+            <w:r>
+              <w:rPr>
+                <w:b/>
+                <w:color w:val="FFFFFF"/>
+              </w:rPr>
+              <w:t>Total Images</w:t>
+            </w:r>
+          </w:p>
+        </w:tc>
+        <w:tc>
+          <w:tcPr>
+            <w:tcW w:type="dxa" w:w="1624"/>
+            <w:shd w:val="clear" w:color="auto" w:fill="1F3864"/>
+          </w:tcPr>
+          <w:p>
+            <w:r>
+              <w:rPr>
+                <w:b/>
+                <w:color w:val="FFFFFF"/>
+              </w:rPr>
+              <w:t>Accuracy</w:t>
+            </w:r>
+          </w:p>
+        </w:tc>
+        <w:tc>
+          <w:tcPr>
+            <w:tcW w:type="dxa" w:w="1624"/>
+            <w:shd w:val="clear" w:color="auto" w:fill="1F3864"/>
+          </w:tcPr>
+          <w:p>
+            <w:r>
+              <w:rPr>
+                <w:b/>
+                <w:color w:val="FFFFFF"/>
+              </w:rPr>
+              <w:t>Weighted Precision</w:t>
+            </w:r>
+          </w:p>
+        </w:tc>
+        <w:tc>
+          <w:tcPr>
+            <w:tcW w:type="dxa" w:w="1624"/>
+            <w:shd w:val="clear" w:color="auto" w:fill="1F3864"/>
+          </w:tcPr>
+          <w:p>
+            <w:r>
+              <w:rPr>
+                <w:b/>
+                <w:color w:val="FFFFFF"/>
+              </w:rPr>
+              <w:t>Weighted Recall</w:t>
+            </w:r>
+          </w:p>
+        </w:tc>
+        <w:tc>
+          <w:tcPr>
+            <w:tcW w:type="dxa" w:w="1624"/>
+            <w:shd w:val="clear" w:color="auto" w:fill="1F3864"/>
+          </w:tcPr>
+          <w:p>
+            <w:r>
+              <w:rPr>
+                <w:b/>
+                <w:color w:val="FFFFFF"/>
+              </w:rPr>
+              <w:t>Weighted F1-Score</w:t>
+            </w:r>
+          </w:p>
+        </w:tc>
+      </w:tr>
+      <w:tr>
+        <w:tc>
+          <w:tcPr>
+            <w:tcW w:type="dxa" w:w="1624"/>
+            <w:shd w:val="clear" w:color="auto" w:fill="F2F6FC"/>
+          </w:tcPr>
+          <w:p>
+            <w:r>
+              <w:t>Validation Split</w:t>
+            </w:r>
+          </w:p>
+        </w:tc>
+        <w:tc>
+          <w:tcPr>
+            <w:tcW w:type="dxa" w:w="1624"/>
+            <w:shd w:val="clear" w:color="auto" w:fill="F2F6FC"/>
+          </w:tcPr>
+          <w:p>
+            <w:r>
+              <w:t>107</w:t>
+            </w:r>
+          </w:p>
+        </w:tc>
+        <w:tc>
+          <w:tcPr>
+            <w:tcW w:type="dxa" w:w="1624"/>
+            <w:shd w:val="clear" w:color="auto" w:fill="F2F6FC"/>
+          </w:tcPr>
+          <w:p>
+            <w:r>
+              <w:t>88.79%</w:t>
+            </w:r>
+          </w:p>
+        </w:tc>
+        <w:tc>
+          <w:tcPr>
+            <w:tcW w:type="dxa" w:w="1624"/>
+            <w:shd w:val="clear" w:color="auto" w:fill="F2F6FC"/>
+          </w:tcPr>
+          <w:p>
+            <w:r>
+              <w:t>0.8879</w:t>
+            </w:r>
+          </w:p>
+        </w:tc>
+        <w:tc>
+          <w:tcPr>
+            <w:tcW w:type="dxa" w:w="1624"/>
+            <w:shd w:val="clear" w:color="auto" w:fill="F2F6FC"/>
+          </w:tcPr>
+          <w:p>
+            <w:r>
+              <w:t>0.8879</w:t>
+            </w:r>
+          </w:p>
+        </w:tc>
+        <w:tc>
+          <w:tcPr>
+            <w:tcW w:type="dxa" w:w="1624"/>
+            <w:shd w:val="clear" w:color="auto" w:fill="F2F6FC"/>
+          </w:tcPr>
+          <w:p>
+            <w:r>
+              <w:t>0.8879</w:t>
+            </w:r>
+          </w:p>
+        </w:tc>
+      </w:tr>
+      <w:tr>
+        <w:tc>
+          <w:tcPr>
+            <w:tcW w:type="dxa" w:w="1624"/>
+            <w:shd w:val="clear" w:color="auto" w:fill="FFFFFF"/>
+          </w:tcPr>
+          <w:p>
+            <w:r>
+              <w:t>Held-Out Test Split</w:t>
+            </w:r>
+          </w:p>
+        </w:tc>
+        <w:tc>
+          <w:tcPr>
+            <w:tcW w:type="dxa" w:w="1624"/>
+            <w:shd w:val="clear" w:color="auto" w:fill="FFFFFF"/>
+          </w:tcPr>
+          <w:p>
+            <w:r>
+              <w:t>107</w:t>
+            </w:r>
+          </w:p>
+        </w:tc>
+        <w:tc>
+          <w:tcPr>
+            <w:tcW w:type="dxa" w:w="1624"/>
+            <w:shd w:val="clear" w:color="auto" w:fill="FFFFFF"/>
+          </w:tcPr>
+          <w:p>
+            <w:r>
+              <w:t>87.85%</w:t>
+            </w:r>
+          </w:p>
+        </w:tc>
+        <w:tc>
+          <w:tcPr>
+            <w:tcW w:type="dxa" w:w="1624"/>
+            <w:shd w:val="clear" w:color="auto" w:fill="FFFFFF"/>
+          </w:tcPr>
+          <w:p>
+            <w:r>
+              <w:t>0.8875</w:t>
+            </w:r>
+          </w:p>
+        </w:tc>
+        <w:tc>
+          <w:tcPr>
+            <w:tcW w:type="dxa" w:w="1624"/>
+            <w:shd w:val="clear" w:color="auto" w:fill="FFFFFF"/>
+          </w:tcPr>
+          <w:p>
+            <w:r>
+              <w:t>0.8785</w:t>
+            </w:r>
+          </w:p>
+        </w:tc>
+        <w:tc>
+          <w:tcPr>
+            <w:tcW w:type="dxa" w:w="1624"/>
+            <w:shd w:val="clear" w:color="auto" w:fill="FFFFFF"/>
+          </w:tcPr>
+          <w:p>
+            <w:r>
+              <w:t>0.8793</w:t>
+            </w:r>
+          </w:p>
+        </w:tc>
+      </w:tr>
+    </w:tbl>
+    <w:p/>
+    <w:p>
+      <w:r>
+        <w:rPr>
+          <w:b w:val="0"/>
+          <w:i w:val="0"/>
+          <w:sz w:val="22"/>
+        </w:rPr>
+        <w:t>On the unbiased held-out test set (107 images), the model achieved 95% precision for the Vegan class (only 3 vegetarian images were mistakenly classified as vegan) and 93% recall for the Vegetarian class, demonstrating strong capability in identifying dairy cheese fillings and rich butter pastries.</w:t>
+      </w:r>
+    </w:p>
+    <w:p/>
+    <w:p>
+      <w:pPr>
+        <w:pStyle w:val="Heading2"/>
+        <w:jc w:val="left"/>
+      </w:pPr>
+      <w:r>
+        <w:rPr>
+          <w:color w:val="2E75B6"/>
+        </w:rPr>
+        <w:t>13.5  Real-World Restaurant Testing (Meat-Free Dishes)</w:t>
+      </w:r>
+    </w:p>
+    <w:tbl>
+      <w:tblPr>
+        <w:tblStyle w:val="TableGrid"/>
+        <w:tblW w:type="auto" w:w="0"/>
+        <w:jc w:val="center"/>
+        <w:tblLook w:firstColumn="1" w:firstRow="1" w:lastColumn="0" w:lastRow="0" w:noHBand="0" w:noVBand="1" w:val="04A0"/>
+      </w:tblPr>
+      <w:tblGrid>
+        <w:gridCol w:w="1949"/>
+        <w:gridCol w:w="1949"/>
+        <w:gridCol w:w="1949"/>
+        <w:gridCol w:w="1949"/>
+        <w:gridCol w:w="1949"/>
+      </w:tblGrid>
+      <w:tr>
+        <w:tc>
+          <w:tcPr>
+            <w:tcW w:type="dxa" w:w="1949"/>
+            <w:shd w:val="clear" w:color="auto" w:fill="1F3864"/>
+          </w:tcPr>
+          <w:p>
+            <w:r>
+              <w:rPr>
+                <w:b/>
+                <w:color w:val="FFFFFF"/>
+              </w:rPr>
+              <w:t>Restaurant Dish</w:t>
+            </w:r>
+          </w:p>
+        </w:tc>
+        <w:tc>
+          <w:tcPr>
+            <w:tcW w:type="dxa" w:w="1949"/>
+            <w:shd w:val="clear" w:color="auto" w:fill="1F3864"/>
+          </w:tcPr>
+          <w:p>
+            <w:r>
+              <w:rPr>
+                <w:b/>
+                <w:color w:val="FFFFFF"/>
+              </w:rPr>
+              <w:t>Ground Truth</w:t>
+            </w:r>
+          </w:p>
+        </w:tc>
+        <w:tc>
+          <w:tcPr>
+            <w:tcW w:type="dxa" w:w="1949"/>
+            <w:shd w:val="clear" w:color="auto" w:fill="1F3864"/>
+          </w:tcPr>
+          <w:p>
+            <w:r>
+              <w:rPr>
+                <w:b/>
+                <w:color w:val="FFFFFF"/>
+              </w:rPr>
+              <w:t>Correct / Total</w:t>
+            </w:r>
+          </w:p>
+        </w:tc>
+        <w:tc>
+          <w:tcPr>
+            <w:tcW w:type="dxa" w:w="1949"/>
+            <w:shd w:val="clear" w:color="auto" w:fill="1F3864"/>
+          </w:tcPr>
+          <w:p>
+            <w:r>
+              <w:rPr>
+                <w:b/>
+                <w:color w:val="FFFFFF"/>
+              </w:rPr>
+              <w:t>Accuracy</w:t>
+            </w:r>
+          </w:p>
+        </w:tc>
+        <w:tc>
+          <w:tcPr>
+            <w:tcW w:type="dxa" w:w="1949"/>
+            <w:shd w:val="clear" w:color="auto" w:fill="1F3864"/>
+          </w:tcPr>
+          <w:p>
+            <w:r>
+              <w:rPr>
+                <w:b/>
+                <w:color w:val="FFFFFF"/>
+              </w:rPr>
+              <w:t>Culinary Analysis</w:t>
+            </w:r>
+          </w:p>
+        </w:tc>
+      </w:tr>
+      <w:tr>
+        <w:tc>
+          <w:tcPr>
+            <w:tcW w:type="dxa" w:w="1949"/>
+            <w:shd w:val="clear" w:color="auto" w:fill="F2F6FC"/>
+          </w:tcPr>
+          <w:p>
+            <w:r>
+              <w:t>Hummus</w:t>
+            </w:r>
+          </w:p>
+        </w:tc>
+        <w:tc>
+          <w:tcPr>
+            <w:tcW w:type="dxa" w:w="1949"/>
+            <w:shd w:val="clear" w:color="auto" w:fill="F2F6FC"/>
+          </w:tcPr>
+          <w:p>
+            <w:r>
+              <w:t>Vegan</w:t>
+            </w:r>
+          </w:p>
+        </w:tc>
+        <w:tc>
+          <w:tcPr>
+            <w:tcW w:type="dxa" w:w="1949"/>
+            <w:shd w:val="clear" w:color="auto" w:fill="F2F6FC"/>
+          </w:tcPr>
+          <w:p>
+            <w:r>
+              <w:t>5 / 5</w:t>
+            </w:r>
+          </w:p>
+        </w:tc>
+        <w:tc>
+          <w:tcPr>
+            <w:tcW w:type="dxa" w:w="1949"/>
+            <w:shd w:val="clear" w:color="auto" w:fill="F2F6FC"/>
+          </w:tcPr>
+          <w:p>
+            <w:r>
+              <w:t>100.0%</w:t>
+            </w:r>
+          </w:p>
+        </w:tc>
+        <w:tc>
+          <w:tcPr>
+            <w:tcW w:type="dxa" w:w="1949"/>
+            <w:shd w:val="clear" w:color="auto" w:fill="F2F6FC"/>
+          </w:tcPr>
+          <w:p>
+            <w:r>
+              <w:t>Perfect plant-based legume dip recognition</w:t>
+            </w:r>
+          </w:p>
+        </w:tc>
+      </w:tr>
+      <w:tr>
+        <w:tc>
+          <w:tcPr>
+            <w:tcW w:type="dxa" w:w="1949"/>
+            <w:shd w:val="clear" w:color="auto" w:fill="FFFFFF"/>
+          </w:tcPr>
+          <w:p>
+            <w:r>
+              <w:t>Okra Tagine</w:t>
+            </w:r>
+          </w:p>
+        </w:tc>
+        <w:tc>
+          <w:tcPr>
+            <w:tcW w:type="dxa" w:w="1949"/>
+            <w:shd w:val="clear" w:color="auto" w:fill="FFFFFF"/>
+          </w:tcPr>
+          <w:p>
+            <w:r>
+              <w:t>Vegan</w:t>
+            </w:r>
+          </w:p>
+        </w:tc>
+        <w:tc>
+          <w:tcPr>
+            <w:tcW w:type="dxa" w:w="1949"/>
+            <w:shd w:val="clear" w:color="auto" w:fill="FFFFFF"/>
+          </w:tcPr>
+          <w:p>
+            <w:r>
+              <w:t>4 / 4</w:t>
+            </w:r>
+          </w:p>
+        </w:tc>
+        <w:tc>
+          <w:tcPr>
+            <w:tcW w:type="dxa" w:w="1949"/>
+            <w:shd w:val="clear" w:color="auto" w:fill="FFFFFF"/>
+          </w:tcPr>
+          <w:p>
+            <w:r>
+              <w:t>100.0%</w:t>
+            </w:r>
+          </w:p>
+        </w:tc>
+        <w:tc>
+          <w:tcPr>
+            <w:tcW w:type="dxa" w:w="1949"/>
+            <w:shd w:val="clear" w:color="auto" w:fill="FFFFFF"/>
+          </w:tcPr>
+          <w:p>
+            <w:r>
+              <w:t>Correctly identified as olive-oil vegetable stew</w:t>
+            </w:r>
+          </w:p>
+        </w:tc>
+      </w:tr>
+      <w:tr>
+        <w:tc>
+          <w:tcPr>
+            <w:tcW w:type="dxa" w:w="1949"/>
+            <w:shd w:val="clear" w:color="auto" w:fill="F2F6FC"/>
+          </w:tcPr>
+          <w:p>
+            <w:r>
+              <w:t>Tamees Bread</w:t>
+            </w:r>
+          </w:p>
+        </w:tc>
+        <w:tc>
+          <w:tcPr>
+            <w:tcW w:type="dxa" w:w="1949"/>
+            <w:shd w:val="clear" w:color="auto" w:fill="F2F6FC"/>
+          </w:tcPr>
+          <w:p>
+            <w:r>
+              <w:t>Vegan</w:t>
+            </w:r>
+          </w:p>
+        </w:tc>
+        <w:tc>
+          <w:tcPr>
+            <w:tcW w:type="dxa" w:w="1949"/>
+            <w:shd w:val="clear" w:color="auto" w:fill="F2F6FC"/>
+          </w:tcPr>
+          <w:p>
+            <w:r>
+              <w:t>5 / 5</w:t>
+            </w:r>
+          </w:p>
+        </w:tc>
+        <w:tc>
+          <w:tcPr>
+            <w:tcW w:type="dxa" w:w="1949"/>
+            <w:shd w:val="clear" w:color="auto" w:fill="F2F6FC"/>
+          </w:tcPr>
+          <w:p>
+            <w:r>
+              <w:t>100.0%</w:t>
+            </w:r>
+          </w:p>
+        </w:tc>
+        <w:tc>
+          <w:tcPr>
+            <w:tcW w:type="dxa" w:w="1949"/>
+            <w:shd w:val="clear" w:color="auto" w:fill="F2F6FC"/>
+          </w:tcPr>
+          <w:p>
+            <w:r>
+              <w:t>Perfect recognition of tandoor plain flatbread</w:t>
+            </w:r>
+          </w:p>
+        </w:tc>
+      </w:tr>
+      <w:tr>
+        <w:tc>
+          <w:tcPr>
+            <w:tcW w:type="dxa" w:w="1949"/>
+            <w:shd w:val="clear" w:color="auto" w:fill="FFFFFF"/>
+          </w:tcPr>
+          <w:p>
+            <w:r>
+              <w:t>Cheese Fatayer</w:t>
+            </w:r>
+          </w:p>
+        </w:tc>
+        <w:tc>
+          <w:tcPr>
+            <w:tcW w:type="dxa" w:w="1949"/>
+            <w:shd w:val="clear" w:color="auto" w:fill="FFFFFF"/>
+          </w:tcPr>
+          <w:p>
+            <w:r>
+              <w:t>Vegetarian</w:t>
+            </w:r>
+          </w:p>
+        </w:tc>
+        <w:tc>
+          <w:tcPr>
+            <w:tcW w:type="dxa" w:w="1949"/>
+            <w:shd w:val="clear" w:color="auto" w:fill="FFFFFF"/>
+          </w:tcPr>
+          <w:p>
+            <w:r>
+              <w:t>4 / 5</w:t>
+            </w:r>
+          </w:p>
+        </w:tc>
+        <w:tc>
+          <w:tcPr>
+            <w:tcW w:type="dxa" w:w="1949"/>
+            <w:shd w:val="clear" w:color="auto" w:fill="FFFFFF"/>
+          </w:tcPr>
+          <w:p>
+            <w:r>
+              <w:t>80.0%</w:t>
+            </w:r>
+          </w:p>
+        </w:tc>
+        <w:tc>
+          <w:tcPr>
+            <w:tcW w:type="dxa" w:w="1949"/>
+            <w:shd w:val="clear" w:color="auto" w:fill="FFFFFF"/>
+          </w:tcPr>
+          <w:p>
+            <w:r>
+              <w:t>Successfully detects dairy cheese; recovered from Veg failure</w:t>
+            </w:r>
+          </w:p>
+        </w:tc>
+      </w:tr>
+      <w:tr>
+        <w:tc>
+          <w:tcPr>
+            <w:tcW w:type="dxa" w:w="1949"/>
+            <w:shd w:val="clear" w:color="auto" w:fill="F2F6FC"/>
+          </w:tcPr>
+          <w:p>
+            <w:r>
+              <w:t>Za’atara Manaqish</w:t>
+            </w:r>
+          </w:p>
+        </w:tc>
+        <w:tc>
+          <w:tcPr>
+            <w:tcW w:type="dxa" w:w="1949"/>
+            <w:shd w:val="clear" w:color="auto" w:fill="F2F6FC"/>
+          </w:tcPr>
+          <w:p>
+            <w:r>
+              <w:t>Vegan</w:t>
+            </w:r>
+          </w:p>
+        </w:tc>
+        <w:tc>
+          <w:tcPr>
+            <w:tcW w:type="dxa" w:w="1949"/>
+            <w:shd w:val="clear" w:color="auto" w:fill="F2F6FC"/>
+          </w:tcPr>
+          <w:p>
+            <w:r>
+              <w:t>2 / 5</w:t>
+            </w:r>
+          </w:p>
+        </w:tc>
+        <w:tc>
+          <w:tcPr>
+            <w:tcW w:type="dxa" w:w="1949"/>
+            <w:shd w:val="clear" w:color="auto" w:fill="F2F6FC"/>
+          </w:tcPr>
+          <w:p>
+            <w:r>
+              <w:t>40.0%</w:t>
+            </w:r>
+          </w:p>
+        </w:tc>
+        <w:tc>
+          <w:tcPr>
+            <w:tcW w:type="dxa" w:w="1949"/>
+            <w:shd w:val="clear" w:color="auto" w:fill="F2F6FC"/>
+          </w:tcPr>
+          <w:p>
+            <w:r>
+              <w:t>Heavy olive oil sheen sometimes mimics melted cheese glaze</w:t>
+            </w:r>
+          </w:p>
+        </w:tc>
+      </w:tr>
+      <w:tr>
+        <w:tc>
+          <w:tcPr>
+            <w:tcW w:type="dxa" w:w="1949"/>
+            <w:shd w:val="clear" w:color="auto" w:fill="FFFFFF"/>
+          </w:tcPr>
+          <w:p>
+            <w:r>
+              <w:t>OVERALL</w:t>
+            </w:r>
+          </w:p>
+        </w:tc>
+        <w:tc>
+          <w:tcPr>
+            <w:tcW w:type="dxa" w:w="1949"/>
+            <w:shd w:val="clear" w:color="auto" w:fill="FFFFFF"/>
+          </w:tcPr>
+          <w:p>
+            <w:r>
+              <w:t>—</w:t>
+            </w:r>
+          </w:p>
+        </w:tc>
+        <w:tc>
+          <w:tcPr>
+            <w:tcW w:type="dxa" w:w="1949"/>
+            <w:shd w:val="clear" w:color="auto" w:fill="FFFFFF"/>
+          </w:tcPr>
+          <w:p>
+            <w:r>
+              <w:t>20 / 24</w:t>
+            </w:r>
+          </w:p>
+        </w:tc>
+        <w:tc>
+          <w:tcPr>
+            <w:tcW w:type="dxa" w:w="1949"/>
+            <w:shd w:val="clear" w:color="auto" w:fill="FFFFFF"/>
+          </w:tcPr>
+          <w:p>
+            <w:r>
+              <w:t>83.33%</w:t>
+            </w:r>
+          </w:p>
+        </w:tc>
+        <w:tc>
+          <w:tcPr>
+            <w:tcW w:type="dxa" w:w="1949"/>
+            <w:shd w:val="clear" w:color="auto" w:fill="FFFFFF"/>
+          </w:tcPr>
+          <w:p>
+            <w:r>
+              <w:t>Strong generalization to unseen restaurant photography</w:t>
+            </w:r>
+          </w:p>
+        </w:tc>
+      </w:tr>
+    </w:tbl>
+    <w:p/>
+    <w:p>
+      <w:pPr>
+        <w:pStyle w:val="Heading2"/>
+        <w:jc w:val="left"/>
+      </w:pPr>
+      <w:r>
+        <w:rPr>
+          <w:color w:val="2E75B6"/>
+        </w:rPr>
+        <w:t>13.6  Standalone Package Structure</w:t>
+      </w:r>
+    </w:p>
+    <w:p>
+      <w:r>
+        <w:rPr>
+          <w:b w:val="0"/>
+          <w:i w:val="0"/>
+          <w:sz w:val="22"/>
+        </w:rPr>
+        <w:t>A dedicated, self-contained package has been published under Vegan_vs_Vegetarian_Classifier/ with its own weights, dataset symlinks, inference tools, and evaluation scripts:</w:t>
+      </w:r>
+    </w:p>
+    <w:p>
+      <w:r>
+        <w:rPr>
+          <w:rFonts w:ascii="Courier New" w:hAnsi="Courier New"/>
+          <w:color w:val="C7254E"/>
+          <w:sz w:val="18"/>
+        </w:rPr>
+        <w:t># Run single-image inference:</w:t>
+        <w:br/>
+        <w:t>.venv/bin/python Vegan_vs_Vegetarian_Classifier/scripts/predict.py --image 'path/to/dish.jpg'</w:t>
+        <w:br/>
+        <w:br/>
+        <w:t># Run held-out test evaluation:</w:t>
+        <w:br/>
+        <w:t>.venv/bin/python Vegan_vs_Vegetarian_Classifier/scripts/evaluate.py --split test</w:t>
+        <w:br/>
+        <w:br/>
+        <w:t># Run real-world restaurant test:</w:t>
+        <w:br/>
+        <w:t>.venv/bin/python Vegan_vs_Vegetarian_Classifier/scripts/evaluate_restaurant.py</w:t>
+      </w:r>
+    </w:p>
     <w:p/>
     <w:p>
       <w:r>
@@ -7933,7 +9675,7 @@
         </w:rPr>
         <w:br/>
         <w:br/>
-        <w:t>DishDetect SA — Walkthrough Book  ·  github.com/Mehdidar/DishDetect-SA  ·  Generated 10 October 2026, 22:03</w:t>
+        <w:t>DishDetect SA — Walkthrough Book  ·  github.com/Mehdidar/DishDetect-SA  ·  Generated 13 October 2026, 00:09</w:t>
       </w:r>
     </w:p>
     <w:sectPr>

</xml_diff>